<commit_message>
Standardize FIRE and HOME NotebookLM navigation
</commit_message>
<xml_diff>
--- a/18_DOCX/FIRE_INDEX_0001.docx
+++ b/18_DOCX/FIRE_INDEX_0001.docx
@@ -7,7 +7,7 @@
         <w:pStyle w:val="Heading1"/>
       </w:pPr>
       <w:r>
-        <w:t>FIRE_INDEX_0001 - Seguro contra incêndio no Japão</w:t>
+        <w:t>FIRE_INDEX_0001 - 火災保険・住宅保険対応ナビゲーション</w:t>
       </w:r>
     </w:p>
     <w:p>
@@ -20,7 +20,7 @@
     </w:p>
     <w:p>
       <w:r>
-        <w:t>FIRE INDEX 0001 - Seguro contra incêndio no Japão</w:t>
+        <w:t>FIRE_INDEX_0001 - 火災保険・住宅保険対応ナビゲーション</w:t>
       </w:r>
     </w:p>
     <w:p>
@@ -33,7 +33,7 @@
     </w:p>
     <w:p>
       <w:r>
-        <w:t>Índice inicial da categoria FIRE para consulta por corretores japoneses que atendem clientes brasileiros residentes no Japão.</w:t>
+        <w:t>火災保険、家財、建物、免責金額、水災、水濡れ、盗難、地震保険、個人賠償責任を、ブラジル人顧客へ説明するための検索導線。 この資料はNotebookLMでの検索を前提とし、日本人保険募集人が日本語で理解し、必要に応じてブラジルポルトガル語の説明文とカタカナ読みを使って顧客対応できるように設計されている。</w:t>
       </w:r>
     </w:p>
     <w:p>
@@ -46,7 +46,7 @@
     </w:p>
     <w:p>
       <w:r>
-        <w:t>火災保険, 建物, 家財, 地震保険, seguro contra incêndio, bens domésticos, franquia, sinistro</w:t>
+        <w:t>火災保険, 建物, 家財, 免責金額, 水災, 水濡れ, 地震保険, ブラジル人顧客, português com katakana</w:t>
       </w:r>
     </w:p>
     <w:p>
@@ -70,14 +70,6 @@
         <w:pStyle w:val="ListBullet"/>
       </w:pPr>
       <w:r>
-        <w:t>Atendimento</w:t>
-      </w:r>
-    </w:p>
-    <w:p>
-      <w:pPr>
-        <w:pStyle w:val="ListBullet"/>
-      </w:pPr>
-      <w:r>
         <w:t>NotebookLM</w:t>
       </w:r>
     </w:p>
@@ -86,7 +78,23 @@
         <w:pStyle w:val="ListBullet"/>
       </w:pPr>
       <w:r>
-        <w:t>Seguro residencial</w:t>
+        <w:t>日本人保険募集人</w:t>
+      </w:r>
+    </w:p>
+    <w:p>
+      <w:pPr>
+        <w:pStyle w:val="ListBullet"/>
+      </w:pPr>
+      <w:r>
+        <w:t>ブラジル人顧客対応</w:t>
+      </w:r>
+    </w:p>
+    <w:p>
+      <w:pPr>
+        <w:pStyle w:val="ListBullet"/>
+      </w:pPr>
+      <w:r>
+        <w:t>Português brasileiro com leitura em katakana</w:t>
       </w:r>
     </w:p>
     <w:p>
@@ -95,6 +103,102 @@
       </w:pPr>
       <w:r>
         <w:t>Conteúdo</w:t>
+      </w:r>
+    </w:p>
+    <w:p>
+      <w:pPr>
+        <w:pStyle w:val="Heading3"/>
+      </w:pPr>
+      <w:r>
+        <w:t>検索方針</w:t>
+      </w:r>
+    </w:p>
+    <w:p>
+      <w:pPr>
+        <w:pStyle w:val="ListBullet"/>
+      </w:pPr>
+      <w:r>
+        <w:t>まず日本語用語で検索する。</w:t>
+      </w:r>
+    </w:p>
+    <w:p>
+      <w:pPr>
+        <w:pStyle w:val="ListBullet"/>
+      </w:pPr>
+      <w:r>
+        <w:t>次にFAQで顧客への短い回答を確認する。</w:t>
+      </w:r>
+    </w:p>
+    <w:p>
+      <w:pPr>
+        <w:pStyle w:val="ListBullet"/>
+      </w:pPr>
+      <w:r>
+        <w:t>会話が必要な場合はDIALOGUEを使い、ポルトガル語の発話とカタカナ読みを確認する。</w:t>
+      </w:r>
+    </w:p>
+    <w:p>
+      <w:pPr>
+        <w:pStyle w:val="ListBullet"/>
+      </w:pPr>
+      <w:r>
+        <w:t>判断が難しい場合はCASEを使い、募集人の対応方針とコンプライアンス上の注意を確認する。</w:t>
+      </w:r>
+    </w:p>
+    <w:p>
+      <w:pPr>
+        <w:pStyle w:val="ListBullet"/>
+      </w:pPr>
+      <w:r>
+        <w:t>支払可否、補償、返金、審査結果は断定しない。</w:t>
+      </w:r>
+    </w:p>
+    <w:p>
+      <w:pPr>
+        <w:pStyle w:val="Heading3"/>
+      </w:pPr>
+      <w:r>
+        <w:t>推奨確認順序</w:t>
+      </w:r>
+    </w:p>
+    <w:p>
+      <w:pPr>
+        <w:pStyle w:val="ListBullet"/>
+      </w:pPr>
+      <w:r>
+        <w:t>FIRE-0001〜FIRE-0004で、火災保険、建物、家財、保険金額を確認する。</w:t>
+      </w:r>
+    </w:p>
+    <w:p>
+      <w:pPr>
+        <w:pStyle w:val="ListBullet"/>
+      </w:pPr>
+      <w:r>
+        <w:t>FIRE-0005〜FIRE-0007で、再調達価額、時価額、免責金額を説明する。</w:t>
+      </w:r>
+    </w:p>
+    <w:p>
+      <w:pPr>
+        <w:pStyle w:val="ListBullet"/>
+      </w:pPr>
+      <w:r>
+        <w:t>FIRE-0008〜FIRE-0017で、火災・自然災害・水濡れ・盗難・破損汚損を切り分ける。</w:t>
+      </w:r>
+    </w:p>
+    <w:p>
+      <w:pPr>
+        <w:pStyle w:val="ListBullet"/>
+      </w:pPr>
+      <w:r>
+        <w:t>FIRE-0018で地震保険を必ず別枠として確認する。</w:t>
+      </w:r>
+    </w:p>
+    <w:p>
+      <w:pPr>
+        <w:pStyle w:val="ListBullet"/>
+      </w:pPr>
+      <w:r>
+        <w:t>FIRE-0020で個人賠償責任特約を第三者損害の観点から説明する。</w:t>
       </w:r>
     </w:p>
     <w:p>
@@ -278,7 +382,7 @@
         <w:pStyle w:val="ListBullet"/>
       </w:pPr>
       <w:r>
-        <w:t>FAQ-FIRE-0001 - Como explicar seguro contra incêndio no seguro contra incêndio?</w:t>
+        <w:t>FAQ-FIRE-0001</w:t>
       </w:r>
     </w:p>
     <w:p>
@@ -286,7 +390,7 @@
         <w:pStyle w:val="ListBullet"/>
       </w:pPr>
       <w:r>
-        <w:t>FAQ-FIRE-0002 - Como explicar edificação no seguro contra incêndio?</w:t>
+        <w:t>FAQ-FIRE-0002</w:t>
       </w:r>
     </w:p>
     <w:p>
@@ -294,7 +398,7 @@
         <w:pStyle w:val="ListBullet"/>
       </w:pPr>
       <w:r>
-        <w:t>FAQ-FIRE-0003 - Como explicar bens domésticos no seguro contra incêndio?</w:t>
+        <w:t>FAQ-FIRE-0003</w:t>
       </w:r>
     </w:p>
     <w:p>
@@ -302,7 +406,7 @@
         <w:pStyle w:val="ListBullet"/>
       </w:pPr>
       <w:r>
-        <w:t>FAQ-FIRE-0004 - Como explicar valor segurado no seguro contra incêndio?</w:t>
+        <w:t>FAQ-FIRE-0004</w:t>
       </w:r>
     </w:p>
     <w:p>
@@ -310,7 +414,7 @@
         <w:pStyle w:val="ListBullet"/>
       </w:pPr>
       <w:r>
-        <w:t>FAQ-FIRE-0005 - Como explicar valor de reposição no seguro contra incêndio?</w:t>
+        <w:t>FAQ-FIRE-0005</w:t>
       </w:r>
     </w:p>
     <w:p>
@@ -318,7 +422,7 @@
         <w:pStyle w:val="ListBullet"/>
       </w:pPr>
       <w:r>
-        <w:t>FAQ-FIRE-0006 - Como explicar valor atual no seguro contra incêndio?</w:t>
+        <w:t>FAQ-FIRE-0006</w:t>
       </w:r>
     </w:p>
     <w:p>
@@ -326,7 +430,7 @@
         <w:pStyle w:val="ListBullet"/>
       </w:pPr>
       <w:r>
-        <w:t>FAQ-FIRE-0007 - Como explicar franquia no seguro contra incêndio?</w:t>
+        <w:t>FAQ-FIRE-0007</w:t>
       </w:r>
     </w:p>
     <w:p>
@@ -334,7 +438,7 @@
         <w:pStyle w:val="ListBullet"/>
       </w:pPr>
       <w:r>
-        <w:t>FAQ-FIRE-0008 - Como explicar incêndio no seguro contra incêndio?</w:t>
+        <w:t>FAQ-FIRE-0008</w:t>
       </w:r>
     </w:p>
     <w:p>
@@ -342,7 +446,7 @@
         <w:pStyle w:val="ListBullet"/>
       </w:pPr>
       <w:r>
-        <w:t>FAQ-FIRE-0009 - Como explicar queda de raio no seguro contra incêndio?</w:t>
+        <w:t>FAQ-FIRE-0009</w:t>
       </w:r>
     </w:p>
     <w:p>
@@ -350,7 +454,7 @@
         <w:pStyle w:val="ListBullet"/>
       </w:pPr>
       <w:r>
-        <w:t>FAQ-FIRE-0010 - Como explicar ruptura ou explosão no seguro contra incêndio?</w:t>
+        <w:t>FAQ-FIRE-0010</w:t>
       </w:r>
     </w:p>
     <w:p>
@@ -358,7 +462,7 @@
         <w:pStyle w:val="ListBullet"/>
       </w:pPr>
       <w:r>
-        <w:t>FAQ-FIRE-0011 - Como explicar danos por vento no seguro contra incêndio?</w:t>
+        <w:t>FAQ-FIRE-0011</w:t>
       </w:r>
     </w:p>
     <w:p>
@@ -366,7 +470,7 @@
         <w:pStyle w:val="ListBullet"/>
       </w:pPr>
       <w:r>
-        <w:t>FAQ-FIRE-0012 - Como explicar danos por granizo no seguro contra incêndio?</w:t>
+        <w:t>FAQ-FIRE-0012</w:t>
       </w:r>
     </w:p>
     <w:p>
@@ -374,7 +478,7 @@
         <w:pStyle w:val="ListBullet"/>
       </w:pPr>
       <w:r>
-        <w:t>FAQ-FIRE-0013 - Como explicar danos por neve no seguro contra incêndio?</w:t>
+        <w:t>FAQ-FIRE-0013</w:t>
       </w:r>
     </w:p>
     <w:p>
@@ -382,7 +486,7 @@
         <w:pStyle w:val="ListBullet"/>
       </w:pPr>
       <w:r>
-        <w:t>FAQ-FIRE-0014 - Como explicar danos por inundação no seguro contra incêndio?</w:t>
+        <w:t>FAQ-FIRE-0014</w:t>
       </w:r>
     </w:p>
     <w:p>
@@ -390,7 +494,7 @@
         <w:pStyle w:val="ListBullet"/>
       </w:pPr>
       <w:r>
-        <w:t>FAQ-FIRE-0015 - Como explicar danos por vazamento de água no seguro contra incêndio?</w:t>
+        <w:t>FAQ-FIRE-0015</w:t>
       </w:r>
     </w:p>
     <w:p>
@@ -398,7 +502,7 @@
         <w:pStyle w:val="ListBullet"/>
       </w:pPr>
       <w:r>
-        <w:t>FAQ-FIRE-0016 - Como explicar furto ou roubo no seguro contra incêndio?</w:t>
+        <w:t>FAQ-FIRE-0016</w:t>
       </w:r>
     </w:p>
     <w:p>
@@ -406,7 +510,7 @@
         <w:pStyle w:val="ListBullet"/>
       </w:pPr>
       <w:r>
-        <w:t>FAQ-FIRE-0017 - Como explicar quebra ou dano acidental no seguro contra incêndio?</w:t>
+        <w:t>FAQ-FIRE-0017</w:t>
       </w:r>
     </w:p>
     <w:p>
@@ -414,7 +518,7 @@
         <w:pStyle w:val="ListBullet"/>
       </w:pPr>
       <w:r>
-        <w:t>FAQ-FIRE-0018 - Como explicar seguro contra terremoto no seguro contra incêndio?</w:t>
+        <w:t>FAQ-FIRE-0018</w:t>
       </w:r>
     </w:p>
     <w:p>
@@ -422,7 +526,7 @@
         <w:pStyle w:val="ListBullet"/>
       </w:pPr>
       <w:r>
-        <w:t>FAQ-FIRE-0019 - Como explicar beneficio para despesas emergenciais no seguro contra incêndio?</w:t>
+        <w:t>FAQ-FIRE-0019</w:t>
       </w:r>
     </w:p>
     <w:p>
@@ -430,7 +534,7 @@
         <w:pStyle w:val="ListBullet"/>
       </w:pPr>
       <w:r>
-        <w:t>FAQ-FIRE-0020 - Como explicar cláusula de responsabilidade civil pessoal no seguro contra incêndio?</w:t>
+        <w:t>FAQ-FIRE-0020</w:t>
       </w:r>
     </w:p>
     <w:p>
@@ -446,7 +550,7 @@
         <w:pStyle w:val="ListBullet"/>
       </w:pPr>
       <w:r>
-        <w:t>DIALOGUE-FIRE-0001 - Separando edificação e bens domésticos</w:t>
+        <w:t>DIALOGUE-FIRE-0001</w:t>
       </w:r>
     </w:p>
     <w:p>
@@ -454,7 +558,7 @@
         <w:pStyle w:val="ListBullet"/>
       </w:pPr>
       <w:r>
-        <w:t>DIALOGUE-FIRE-0002 - Explicando franquia e valor de reposição</w:t>
+        <w:t>DIALOGUE-FIRE-0002</w:t>
       </w:r>
     </w:p>
     <w:p>
@@ -462,7 +566,7 @@
         <w:pStyle w:val="ListBullet"/>
       </w:pPr>
       <w:r>
-        <w:t>DIALOGUE-FIRE-0003 - Danos por vento, granizo e neve</w:t>
+        <w:t>DIALOGUE-FIRE-0003</w:t>
       </w:r>
     </w:p>
     <w:p>
@@ -470,7 +574,7 @@
         <w:pStyle w:val="ListBullet"/>
       </w:pPr>
       <w:r>
-        <w:t>DIALOGUE-FIRE-0004 - Inundação, vazamento e roubo</w:t>
+        <w:t>DIALOGUE-FIRE-0004</w:t>
       </w:r>
     </w:p>
     <w:p>
@@ -478,7 +582,7 @@
         <w:pStyle w:val="ListBullet"/>
       </w:pPr>
       <w:r>
-        <w:t>DIALOGUE-FIRE-0005 - Dano acidental, terremoto e responsabilidade civil</w:t>
+        <w:t>DIALOGUE-FIRE-0005</w:t>
       </w:r>
     </w:p>
     <w:p>
@@ -494,7 +598,7 @@
         <w:pStyle w:val="ListBullet"/>
       </w:pPr>
       <w:r>
-        <w:t>CASE-FIRE-0001 - Cliente alugando apartamento quer saber se precisa proteger bens domésticos</w:t>
+        <w:t>CASE-FIRE-0001</w:t>
       </w:r>
     </w:p>
     <w:p>
@@ -502,7 +606,7 @@
         <w:pStyle w:val="ListBullet"/>
       </w:pPr>
       <w:r>
-        <w:t>CASE-FIRE-0002 - Cliente proprietário precisa definir valor segurado da edificação</w:t>
+        <w:t>CASE-FIRE-0002</w:t>
       </w:r>
     </w:p>
     <w:p>
@@ -510,7 +614,7 @@
         <w:pStyle w:val="ListBullet"/>
       </w:pPr>
       <w:r>
-        <w:t>CASE-FIRE-0003 - Cliente sofreu dano por tufão e quer acionar o seguro</w:t>
+        <w:t>CASE-FIRE-0003</w:t>
       </w:r>
     </w:p>
     <w:p>
@@ -518,7 +622,7 @@
         <w:pStyle w:val="ListBullet"/>
       </w:pPr>
       <w:r>
-        <w:t>CASE-FIRE-0004 - Cliente confunde inundação com vazamento interno</w:t>
+        <w:t>CASE-FIRE-0004</w:t>
       </w:r>
     </w:p>
     <w:p>
@@ -526,7 +630,7 @@
         <w:pStyle w:val="ListBullet"/>
       </w:pPr>
       <w:r>
-        <w:t>CASE-FIRE-0005 - Cliente pergunta se furto de bens dentro da residência está coberto</w:t>
+        <w:t>CASE-FIRE-0005</w:t>
       </w:r>
     </w:p>
     <w:p>
@@ -534,7 +638,7 @@
         <w:pStyle w:val="ListBullet"/>
       </w:pPr>
       <w:r>
-        <w:t>CASE-FIRE-0006 - Cliente quer cobertura para quebra acidental dentro da casa</w:t>
+        <w:t>CASE-FIRE-0006</w:t>
       </w:r>
     </w:p>
     <w:p>
@@ -542,7 +646,7 @@
         <w:pStyle w:val="ListBullet"/>
       </w:pPr>
       <w:r>
-        <w:t>CASE-FIRE-0007 - Cliente pergunta se terremoto está incluído no seguro contra incêndio</w:t>
+        <w:t>CASE-FIRE-0007</w:t>
       </w:r>
     </w:p>
     <w:p>
@@ -550,7 +654,7 @@
         <w:pStyle w:val="ListBullet"/>
       </w:pPr>
       <w:r>
-        <w:t>CASE-FIRE-0008 - Vazamento causa dano ao apartamento de baixo</w:t>
+        <w:t>CASE-FIRE-0008</w:t>
       </w:r>
     </w:p>
     <w:p>
@@ -614,7 +718,31 @@
         <w:pStyle w:val="ListBullet"/>
       </w:pPr>
       <w:r>
-        <w:t>`16_NotebookLM/FIRE_NOTEBOOKLM_PACK_0001.md`</w:t>
+        <w:t>`19_Markdown/FIRE/FIRE_TERMS_0001_0020.md`</w:t>
+      </w:r>
+    </w:p>
+    <w:p>
+      <w:pPr>
+        <w:pStyle w:val="ListBullet"/>
+      </w:pPr>
+      <w:r>
+        <w:t>`19_Markdown/FIRE/FIRE_FAQ_0001_0020.md`</w:t>
+      </w:r>
+    </w:p>
+    <w:p>
+      <w:pPr>
+        <w:pStyle w:val="ListBullet"/>
+      </w:pPr>
+      <w:r>
+        <w:t>`19_Markdown/FIRE/FIRE_DIALOGUES_0001_0005.md`</w:t>
+      </w:r>
+    </w:p>
+    <w:p>
+      <w:pPr>
+        <w:pStyle w:val="ListBullet"/>
+      </w:pPr>
+      <w:r>
+        <w:t>`19_Markdown/FIRE/FIRE_CASES_0001_0008.md`</w:t>
       </w:r>
     </w:p>
     <w:sectPr>

</xml_diff>